<commit_message>
App: admin 2FA, idle timeout, audit log, account export/delete, offline cache, tooltips; ops runbook; SRS and docs updated
Co-Authored-By: Claude Sonnet 5.5 <noreply@anthropic.com>
</commit_message>
<xml_diff>
--- a/MySun_SRS.docx
+++ b/MySun_SRS.docx
@@ -187,7 +187,7 @@
                 <w:sz w:val="18"/>
                 <w:szCs w:val="18"/>
               </w:rPr>
-              <w:t>1.0</w:t>
+              <w:t>1.2</w:t>
             </w:r>
           </w:p>
         </w:tc>
@@ -244,7 +244,7 @@
                 <w:sz w:val="18"/>
                 <w:szCs w:val="18"/>
               </w:rPr>
-              <w:t>8 October 2026</w:t>
+              <w:t>16 October 2026</w:t>
             </w:r>
           </w:p>
         </w:tc>
@@ -358,7 +358,7 @@
                 <w:sz w:val="18"/>
                 <w:szCs w:val="18"/>
               </w:rPr>
-              <w:t>Baseline, reflects the implemented system</w:t>
+              <w:t>Updated to the implemented system, October 2026</w:t>
             </w:r>
           </w:p>
         </w:tc>
@@ -3529,7 +3529,7 @@
         <w:t>Out of scope for the current release:</w:t>
       </w:r>
       <w:r>
-        <w:t xml:space="preserve"> iOS build, a standalone web admin portal, real-time WebSocket updates, in-app booking and payments, two-factor authentication, audit logging, scheduled posting and university SSO.</w:t>
+        <w:t xml:space="preserve"> iOS build, a standalone web admin portal, real-time WebSocket updates, payments, two-factor authentication, audit logging and university SSO.</w:t>
       </w:r>
     </w:p>
     <w:p>
@@ -4629,7 +4629,7 @@
         <w:t>Key architectural decisions.</w:t>
       </w:r>
       <w:r>
-        <w:t xml:space="preserve"> (1) Admin functions are an extra tab in the same app, not a separate portal. (2) Publishing is immediate and moderation is remove-only; there is no pre-approval queue. (3) Authorisation is enforced in FastAPI; RLS policies exist as a baseline.</w:t>
+        <w:t xml:space="preserve"> (1) Admin functions are an extra tab in the same app, not a separate portal. (2) Publishing is immediate (or at a scheduled time) and moderation is remove-only; there is no pre-approval queue. (3) Authorisation is enforced in FastAPI; RLS policies exist as a baseline. (4) Push notifications are sent through Firebase Cloud Messaging (HTTP v1) using a server-side service-account key.</w:t>
       </w:r>
     </w:p>
     <w:p>
@@ -6171,7 +6171,7 @@
                 <w:sz w:val="18"/>
                 <w:szCs w:val="18"/>
               </w:rPr>
-              <w:t>The system shall let a user reset a forgotten password through an emailed link.</w:t>
+              <w:t>The system shall let a user reset a forgotten password through an emailed link (POST /auth/password-reset, always answering 202 so it cannot reveal which emails are registered). The link's landing page depends on the Supabase Site URL setting.</w:t>
             </w:r>
           </w:p>
         </w:tc>
@@ -6223,7 +6223,7 @@
                 <w:sz w:val="18"/>
                 <w:szCs w:val="18"/>
               </w:rPr>
-              <w:t>Partial</w:t>
+              <w:t>Built</w:t>
             </w:r>
           </w:p>
         </w:tc>
@@ -6280,7 +6280,7 @@
                 <w:sz w:val="18"/>
                 <w:szCs w:val="18"/>
               </w:rPr>
-              <w:t>The system shall support two-factor authentication for admin accounts.</w:t>
+              <w:t>The system shall support TOTP two-factor authentication for admin and minor-admin accounts: enrolment in Profile, a code prompt after the password, and optional enforcement (ADMIN_REQUIRE_2FA) that rejects admin sessions that have not passed the code check.</w:t>
             </w:r>
           </w:p>
         </w:tc>
@@ -6332,7 +6332,7 @@
                 <w:sz w:val="18"/>
                 <w:szCs w:val="18"/>
               </w:rPr>
-              <w:t>Planned</w:t>
+              <w:t>Built</w:t>
             </w:r>
           </w:p>
         </w:tc>
@@ -6389,7 +6389,7 @@
                 <w:sz w:val="18"/>
                 <w:szCs w:val="18"/>
               </w:rPr>
-              <w:t>The system shall let a user export and delete their personal data.</w:t>
+              <w:t>The system shall let a user export their personal data (GET /auth/me/export) and delete their account (DELETE /auth/me), both from the Profile screen.</w:t>
             </w:r>
           </w:p>
         </w:tc>
@@ -6441,7 +6441,7 @@
                 <w:sz w:val="18"/>
                 <w:szCs w:val="18"/>
               </w:rPr>
-              <w:t>Planned</w:t>
+              <w:t>Built</w:t>
             </w:r>
           </w:p>
         </w:tc>
@@ -7737,7 +7737,7 @@
                 <w:sz w:val="18"/>
                 <w:szCs w:val="18"/>
               </w:rPr>
-              <w:t>Partial</w:t>
+              <w:t>Built</w:t>
             </w:r>
           </w:p>
         </w:tc>
@@ -7794,7 +7794,7 @@
                 <w:sz w:val="18"/>
                 <w:szCs w:val="18"/>
               </w:rPr>
-              <w:t>The system shall provide full-text search across all content types.</w:t>
+              <w:t>The system shall provide search across announcements, events, accommodation and boda riders (GET /search).</w:t>
             </w:r>
           </w:p>
         </w:tc>
@@ -7846,7 +7846,7 @@
                 <w:sz w:val="18"/>
                 <w:szCs w:val="18"/>
               </w:rPr>
-              <w:t>Planned</w:t>
+              <w:t>Built</w:t>
             </w:r>
           </w:p>
         </w:tc>
@@ -8387,7 +8387,7 @@
                 <w:sz w:val="18"/>
                 <w:szCs w:val="18"/>
               </w:rPr>
-              <w:t>The app shall let a user add an event to the device calendar and set a reminder.</w:t>
+              <w:t>The app shall let a user add an event to the device calendar, which applies its own reminder.</w:t>
             </w:r>
           </w:p>
         </w:tc>
@@ -8439,7 +8439,7 @@
                 <w:sz w:val="18"/>
                 <w:szCs w:val="18"/>
               </w:rPr>
-              <w:t>Planned</w:t>
+              <w:t>Built</w:t>
             </w:r>
           </w:p>
         </w:tc>
@@ -8548,7 +8548,116 @@
                 <w:sz w:val="18"/>
                 <w:szCs w:val="18"/>
               </w:rPr>
-              <w:t>Planned</w:t>
+              <w:t>Built</w:t>
+            </w:r>
+          </w:p>
+        </w:tc>
+      </w:tr>
+      <w:tr>
+        <w:trPr>
+          <w:cantSplit/>
+        </w:trPr>
+        <w:tc>
+          <w:tcPr>
+            <w:tcW w:w="1079" w:type="dxa"/>
+            <w:tcBorders>
+              <w:top w:val="single" w:sz="4" w:space="0" w:color="BFC8D2"/>
+              <w:left w:val="single" w:sz="4" w:space="0" w:color="BFC8D2"/>
+              <w:bottom w:val="single" w:sz="4" w:space="0" w:color="BFC8D2"/>
+              <w:right w:val="single" w:sz="4" w:space="0" w:color="BFC8D2"/>
+            </w:tcBorders>
+            <w:tcMar>
+              <w:top w:w="60" w:type="dxa"/>
+              <w:left w:w="100" w:type="dxa"/>
+              <w:bottom w:w="60" w:type="dxa"/>
+              <w:right w:w="100" w:type="dxa"/>
+            </w:tcMar>
+          </w:tcPr>
+          <w:p>
+            <w:r>
+              <w:rPr>
+                <w:sz w:val="18"/>
+                <w:szCs w:val="18"/>
+              </w:rPr>
+              <w:t>FR-EVT-06</w:t>
+            </w:r>
+          </w:p>
+        </w:tc>
+        <w:tc>
+          <w:tcPr>
+            <w:tcW w:w="6181" w:type="dxa"/>
+            <w:tcBorders>
+              <w:top w:val="single" w:sz="4" w:space="0" w:color="BFC8D2"/>
+              <w:left w:val="single" w:sz="4" w:space="0" w:color="BFC8D2"/>
+              <w:bottom w:val="single" w:sz="4" w:space="0" w:color="BFC8D2"/>
+              <w:right w:val="single" w:sz="4" w:space="0" w:color="BFC8D2"/>
+            </w:tcBorders>
+            <w:tcMar>
+              <w:top w:w="60" w:type="dxa"/>
+              <w:left w:w="100" w:type="dxa"/>
+              <w:bottom w:w="60" w:type="dxa"/>
+              <w:right w:w="100" w:type="dxa"/>
+            </w:tcMar>
+          </w:tcPr>
+          <w:p>
+            <w:r>
+              <w:rPr>
+                <w:sz w:val="18"/>
+                <w:szCs w:val="18"/>
+              </w:rPr>
+              <w:t>The system shall send each registered or bookmarked user at most one reminder per event and kind (day, hour), even when reminder jobs overlap.</w:t>
+            </w:r>
+          </w:p>
+        </w:tc>
+        <w:tc>
+          <w:tcPr>
+            <w:tcW w:w="589" w:type="dxa"/>
+            <w:tcBorders>
+              <w:top w:val="single" w:sz="4" w:space="0" w:color="BFC8D2"/>
+              <w:left w:val="single" w:sz="4" w:space="0" w:color="BFC8D2"/>
+              <w:bottom w:val="single" w:sz="4" w:space="0" w:color="BFC8D2"/>
+              <w:right w:val="single" w:sz="4" w:space="0" w:color="BFC8D2"/>
+            </w:tcBorders>
+            <w:tcMar>
+              <w:top w:w="60" w:type="dxa"/>
+              <w:left w:w="100" w:type="dxa"/>
+              <w:bottom w:w="60" w:type="dxa"/>
+              <w:right w:w="100" w:type="dxa"/>
+            </w:tcMar>
+          </w:tcPr>
+          <w:p>
+            <w:r>
+              <w:rPr>
+                <w:sz w:val="18"/>
+                <w:szCs w:val="18"/>
+              </w:rPr>
+              <w:t>S</w:t>
+            </w:r>
+          </w:p>
+        </w:tc>
+        <w:tc>
+          <w:tcPr>
+            <w:tcW w:w="1177" w:type="dxa"/>
+            <w:tcBorders>
+              <w:top w:val="single" w:sz="4" w:space="0" w:color="BFC8D2"/>
+              <w:left w:val="single" w:sz="4" w:space="0" w:color="BFC8D2"/>
+              <w:bottom w:val="single" w:sz="4" w:space="0" w:color="BFC8D2"/>
+              <w:right w:val="single" w:sz="4" w:space="0" w:color="BFC8D2"/>
+            </w:tcBorders>
+            <w:tcMar>
+              <w:top w:w="60" w:type="dxa"/>
+              <w:left w:w="100" w:type="dxa"/>
+              <w:bottom w:w="60" w:type="dxa"/>
+              <w:right w:w="100" w:type="dxa"/>
+            </w:tcMar>
+          </w:tcPr>
+          <w:p>
+            <w:r>
+              <w:rPr>
+                <w:sz w:val="18"/>
+                <w:szCs w:val="18"/>
+              </w:rPr>
+              <w:t>Built</w:t>
             </w:r>
           </w:p>
         </w:tc>
@@ -8931,7 +9040,7 @@
                 <w:sz w:val="18"/>
                 <w:szCs w:val="18"/>
               </w:rPr>
-              <w:t>Partial</w:t>
+              <w:t>Built</w:t>
             </w:r>
           </w:p>
         </w:tc>
@@ -9425,7 +9534,7 @@
                 <w:sz w:val="18"/>
                 <w:szCs w:val="18"/>
               </w:rPr>
-              <w:t>The system shall let students rate boda riders.</w:t>
+              <w:t>The system shall let students rate boda riders from one to five stars, and show the average rating and rating count.</w:t>
             </w:r>
           </w:p>
         </w:tc>
@@ -9477,7 +9586,7 @@
                 <w:sz w:val="18"/>
                 <w:szCs w:val="18"/>
               </w:rPr>
-              <w:t>Planned</w:t>
+              <w:t>Built</w:t>
             </w:r>
           </w:p>
         </w:tc>
@@ -9534,7 +9643,7 @@
                 <w:sz w:val="18"/>
                 <w:szCs w:val="18"/>
               </w:rPr>
-              <w:t>The system shall support in-app booking.</w:t>
+              <w:t>The system shall let a student request a boda booking, and let the rider's owner accept or decline it and the student cancel it. Owners are notified of new requests. Payments are not supported.</w:t>
             </w:r>
           </w:p>
         </w:tc>
@@ -9586,7 +9695,7 @@
                 <w:sz w:val="18"/>
                 <w:szCs w:val="18"/>
               </w:rPr>
-              <w:t>Planned</w:t>
+              <w:t>Built</w:t>
             </w:r>
           </w:p>
         </w:tc>
@@ -9643,7 +9752,7 @@
                 <w:sz w:val="18"/>
                 <w:szCs w:val="18"/>
               </w:rPr>
-              <w:t>The system shall support additional services (food, health, IT support, library).</w:t>
+              <w:t>The system shall support additional services (food, health, IT support, library). A generic campus-services directory is built; dedicated modules for each service are not.</w:t>
             </w:r>
           </w:p>
         </w:tc>
@@ -9695,7 +9804,7 @@
                 <w:sz w:val="18"/>
                 <w:szCs w:val="18"/>
               </w:rPr>
-              <w:t>Planned</w:t>
+              <w:t>Built</w:t>
             </w:r>
           </w:p>
         </w:tc>
@@ -10626,7 +10735,7 @@
                 <w:sz w:val="18"/>
                 <w:szCs w:val="18"/>
               </w:rPr>
-              <w:t>The system shall deliver push notifications to the device, including event reminders a day and an hour before start.</w:t>
+              <w:t>The system shall deliver push notifications to the device through Firebase Cloud Messaging, including event reminders a day and an hour before start to registered and bookmarked users. Implemented and covered by backend tests; on-device verification is pending.</w:t>
             </w:r>
           </w:p>
         </w:tc>
@@ -10678,7 +10787,7 @@
                 <w:sz w:val="18"/>
                 <w:szCs w:val="18"/>
               </w:rPr>
-              <w:t>Planned</w:t>
+              <w:t>Partial</w:t>
             </w:r>
           </w:p>
         </w:tc>
@@ -10787,7 +10896,7 @@
                 <w:sz w:val="18"/>
                 <w:szCs w:val="18"/>
               </w:rPr>
-              <w:t>Planned</w:t>
+              <w:t>Built</w:t>
             </w:r>
           </w:p>
         </w:tc>
@@ -10844,7 +10953,7 @@
                 <w:sz w:val="18"/>
                 <w:szCs w:val="18"/>
               </w:rPr>
-              <w:t>The user shall be able to choose notification categories in the profile settings.</w:t>
+              <w:t>The user shall be able to choose notification categories in the profile settings; switched-off categories are not delivered (system notices always are).</w:t>
             </w:r>
           </w:p>
         </w:tc>
@@ -10896,7 +11005,116 @@
                 <w:sz w:val="18"/>
                 <w:szCs w:val="18"/>
               </w:rPr>
-              <w:t>Partial</w:t>
+              <w:t>Built</w:t>
+            </w:r>
+          </w:p>
+        </w:tc>
+      </w:tr>
+      <w:tr>
+        <w:trPr>
+          <w:cantSplit/>
+        </w:trPr>
+        <w:tc>
+          <w:tcPr>
+            <w:tcW w:w="1079" w:type="dxa"/>
+            <w:tcBorders>
+              <w:top w:val="single" w:sz="4" w:space="0" w:color="BFC8D2"/>
+              <w:left w:val="single" w:sz="4" w:space="0" w:color="BFC8D2"/>
+              <w:bottom w:val="single" w:sz="4" w:space="0" w:color="BFC8D2"/>
+              <w:right w:val="single" w:sz="4" w:space="0" w:color="BFC8D2"/>
+            </w:tcBorders>
+            <w:tcMar>
+              <w:top w:w="60" w:type="dxa"/>
+              <w:left w:w="100" w:type="dxa"/>
+              <w:bottom w:w="60" w:type="dxa"/>
+              <w:right w:w="100" w:type="dxa"/>
+            </w:tcMar>
+          </w:tcPr>
+          <w:p>
+            <w:r>
+              <w:rPr>
+                <w:sz w:val="18"/>
+                <w:szCs w:val="18"/>
+              </w:rPr>
+              <w:t>FR-NOT-06</w:t>
+            </w:r>
+          </w:p>
+        </w:tc>
+        <w:tc>
+          <w:tcPr>
+            <w:tcW w:w="6181" w:type="dxa"/>
+            <w:tcBorders>
+              <w:top w:val="single" w:sz="4" w:space="0" w:color="BFC8D2"/>
+              <w:left w:val="single" w:sz="4" w:space="0" w:color="BFC8D2"/>
+              <w:bottom w:val="single" w:sz="4" w:space="0" w:color="BFC8D2"/>
+              <w:right w:val="single" w:sz="4" w:space="0" w:color="BFC8D2"/>
+            </w:tcBorders>
+            <w:tcMar>
+              <w:top w:w="60" w:type="dxa"/>
+              <w:left w:w="100" w:type="dxa"/>
+              <w:bottom w:w="60" w:type="dxa"/>
+              <w:right w:w="100" w:type="dxa"/>
+            </w:tcMar>
+          </w:tcPr>
+          <w:p>
+            <w:r>
+              <w:rPr>
+                <w:sz w:val="18"/>
+                <w:szCs w:val="18"/>
+              </w:rPr>
+              <w:t>A user's device token shall be registered with the backend on login and removed on logout. Tokens that Firebase reports as unregistered or invalid shall be deleted; other delivery errors shall not remove a token.</w:t>
+            </w:r>
+          </w:p>
+        </w:tc>
+        <w:tc>
+          <w:tcPr>
+            <w:tcW w:w="589" w:type="dxa"/>
+            <w:tcBorders>
+              <w:top w:val="single" w:sz="4" w:space="0" w:color="BFC8D2"/>
+              <w:left w:val="single" w:sz="4" w:space="0" w:color="BFC8D2"/>
+              <w:bottom w:val="single" w:sz="4" w:space="0" w:color="BFC8D2"/>
+              <w:right w:val="single" w:sz="4" w:space="0" w:color="BFC8D2"/>
+            </w:tcBorders>
+            <w:tcMar>
+              <w:top w:w="60" w:type="dxa"/>
+              <w:left w:w="100" w:type="dxa"/>
+              <w:bottom w:w="60" w:type="dxa"/>
+              <w:right w:w="100" w:type="dxa"/>
+            </w:tcMar>
+          </w:tcPr>
+          <w:p>
+            <w:r>
+              <w:rPr>
+                <w:sz w:val="18"/>
+                <w:szCs w:val="18"/>
+              </w:rPr>
+              <w:t>M</w:t>
+            </w:r>
+          </w:p>
+        </w:tc>
+        <w:tc>
+          <w:tcPr>
+            <w:tcW w:w="1177" w:type="dxa"/>
+            <w:tcBorders>
+              <w:top w:val="single" w:sz="4" w:space="0" w:color="BFC8D2"/>
+              <w:left w:val="single" w:sz="4" w:space="0" w:color="BFC8D2"/>
+              <w:bottom w:val="single" w:sz="4" w:space="0" w:color="BFC8D2"/>
+              <w:right w:val="single" w:sz="4" w:space="0" w:color="BFC8D2"/>
+            </w:tcBorders>
+            <w:tcMar>
+              <w:top w:w="60" w:type="dxa"/>
+              <w:left w:w="100" w:type="dxa"/>
+              <w:bottom w:w="60" w:type="dxa"/>
+              <w:right w:w="100" w:type="dxa"/>
+            </w:tcMar>
+          </w:tcPr>
+          <w:p>
+            <w:r>
+              <w:rPr>
+                <w:sz w:val="18"/>
+                <w:szCs w:val="18"/>
+              </w:rPr>
+              <w:t>Built</w:t>
             </w:r>
           </w:p>
         </w:tc>
@@ -11110,7 +11328,7 @@
                 <w:sz w:val="18"/>
                 <w:szCs w:val="18"/>
               </w:rPr>
-              <w:t>A publisher shall be able to create announcements, events, accommodation listings and boda rider entries. Content shall go live immediately on submission.</w:t>
+              <w:t>A publisher shall be able to create announcements, events, accommodation listings and boda rider entries. Content shall go live immediately on submission, or at the chosen time for scheduled announcements and events.</w:t>
             </w:r>
           </w:p>
         </w:tc>
@@ -11889,7 +12107,7 @@
                 <w:sz w:val="18"/>
                 <w:szCs w:val="18"/>
               </w:rPr>
-              <w:t>The system shall show a publisher a performance summary (items published, views, engagement).</w:t>
+              <w:t>The system shall show a publisher a performance summary: items published, real views, and engagement (bookmarks and registrations per view).</w:t>
             </w:r>
           </w:p>
         </w:tc>
@@ -11941,7 +12159,7 @@
                 <w:sz w:val="18"/>
                 <w:szCs w:val="18"/>
               </w:rPr>
-              <w:t>Partial</w:t>
+              <w:t>Built</w:t>
             </w:r>
           </w:p>
         </w:tc>
@@ -12107,7 +12325,7 @@
                 <w:sz w:val="18"/>
                 <w:szCs w:val="18"/>
               </w:rPr>
-              <w:t>The system shall support scheduled posting.</w:t>
+              <w:t>The system shall support scheduled posting of announcements and events (between one minute and one year ahead). Scheduled items stay hidden from public lists until their time; the publisher can reschedule or publish early; the new-content alert is sent when the time arrives.</w:t>
             </w:r>
           </w:p>
         </w:tc>
@@ -12696,7 +12914,7 @@
                 <w:sz w:val="18"/>
                 <w:szCs w:val="18"/>
               </w:rPr>
-              <w:t>A Super Admin shall see an analytics summary: users, publishers, announcements and events published, engagement and system health.</w:t>
+              <w:t>A Super Admin shall see an analytics summary: users, publishers, live announcements and events, daily and monthly active users (from last-seen tracking) and engagement.</w:t>
             </w:r>
           </w:p>
         </w:tc>
@@ -12748,7 +12966,7 @@
                 <w:sz w:val="18"/>
                 <w:szCs w:val="18"/>
               </w:rPr>
-              <w:t>Partial</w:t>
+              <w:t>Built</w:t>
             </w:r>
           </w:p>
         </w:tc>
@@ -12805,7 +13023,7 @@
                 <w:sz w:val="18"/>
                 <w:szCs w:val="18"/>
               </w:rPr>
-              <w:t>The system shall keep an audit log of all administrator actions (role changes, removals, logins).</w:t>
+              <w:t>The system shall keep an audit log of administrator actions (role changes, removals, verification changes, user exports, account deletions, two-factor checks), viewable by a Super Admin.</w:t>
             </w:r>
           </w:p>
         </w:tc>
@@ -12857,7 +13075,7 @@
                 <w:sz w:val="18"/>
                 <w:szCs w:val="18"/>
               </w:rPr>
-              <w:t>Planned</w:t>
+              <w:t>Built</w:t>
             </w:r>
           </w:p>
         </w:tc>
@@ -12914,7 +13132,7 @@
                 <w:sz w:val="18"/>
                 <w:szCs w:val="18"/>
               </w:rPr>
-              <w:t>The system shall let a Super Admin export user data as CSV.</w:t>
+              <w:t>The system shall let a Super Admin export user data as CSV (formula-safe), and shall log the export.</w:t>
             </w:r>
           </w:p>
         </w:tc>
@@ -12966,7 +13184,7 @@
                 <w:sz w:val="18"/>
                 <w:szCs w:val="18"/>
               </w:rPr>
-              <w:t>Planned</w:t>
+              <w:t>Built</w:t>
             </w:r>
           </w:p>
         </w:tc>
@@ -12987,7 +13205,7 @@
         <w:ind w:left="160"/>
       </w:pPr>
       <w:r>
-        <w:t>Analytics figures for active users, engagement and system health are illustrative until usage tracking is built. Content and user counts are real.</w:t>
+        <w:t>Active users come from last-seen tracking, and engagement is monthly active users as a share of all users. Database and storage health are reported as nominal values, not measurements.</w:t>
       </w:r>
     </w:p>
     <w:p>
@@ -13520,7 +13738,7 @@
                 <w:sz w:val="18"/>
                 <w:szCs w:val="18"/>
               </w:rPr>
-              <w:t>The app shall cache the last loaded feed for read-only offline viewing.</w:t>
+              <w:t>The app shall cache the last loaded announcements and events and show them read-only when the network is unavailable.</w:t>
             </w:r>
           </w:p>
         </w:tc>
@@ -13572,7 +13790,7 @@
                 <w:sz w:val="18"/>
                 <w:szCs w:val="18"/>
               </w:rPr>
-              <w:t>Partial</w:t>
+              <w:t>Built</w:t>
             </w:r>
           </w:p>
         </w:tc>
@@ -14124,7 +14342,7 @@
                 <w:sz w:val="18"/>
                 <w:szCs w:val="18"/>
               </w:rPr>
-              <w:t>The UI shall meet WCAG 2.1 AA colour contrast and provide labels for screen readers.</w:t>
+              <w:t>The UI shall meet WCAG 2.1 AA colour contrast and provide labels for screen readers. Icon buttons now carry tooltips; a full audit is still to be done.</w:t>
             </w:r>
           </w:p>
         </w:tc>
@@ -14176,7 +14394,7 @@
                 <w:sz w:val="18"/>
                 <w:szCs w:val="18"/>
               </w:rPr>
-              <w:t>Planned</w:t>
+              <w:t>Partial</w:t>
             </w:r>
           </w:p>
         </w:tc>
@@ -14563,6 +14781,21 @@
               </w:rPr>
               <w:t>DELETE /{id}</w:t>
             </w:r>
+            <w:r>
+              <w:rPr>
+                <w:sz w:val="18"/>
+                <w:szCs w:val="18"/>
+              </w:rPr>
+              <w:t xml:space="preserve">, </w:t>
+            </w:r>
+            <w:r>
+              <w:rPr>
+                <w:rFonts w:ascii="Consolas" w:eastAsia="Consolas" w:hAnsi="Consolas" w:cs="Consolas"/>
+                <w:sz w:val="18"/>
+                <w:szCs w:val="18"/>
+              </w:rPr>
+              <w:t>PATCH /{id}/schedule</w:t>
+            </w:r>
           </w:p>
         </w:tc>
         <w:tc>
@@ -14692,6 +14925,66 @@
               </w:rPr>
               <w:t>DELETE /{id}</w:t>
             </w:r>
+            <w:r>
+              <w:rPr>
+                <w:sz w:val="18"/>
+                <w:szCs w:val="18"/>
+              </w:rPr>
+              <w:t xml:space="preserve">, </w:t>
+            </w:r>
+            <w:r>
+              <w:rPr>
+                <w:rFonts w:ascii="Consolas" w:eastAsia="Consolas" w:hAnsi="Consolas" w:cs="Consolas"/>
+                <w:sz w:val="18"/>
+                <w:szCs w:val="18"/>
+              </w:rPr>
+              <w:t>PATCH /{id}/schedule</w:t>
+            </w:r>
+            <w:r>
+              <w:rPr>
+                <w:sz w:val="18"/>
+                <w:szCs w:val="18"/>
+              </w:rPr>
+              <w:t xml:space="preserve">, </w:t>
+            </w:r>
+            <w:r>
+              <w:rPr>
+                <w:rFonts w:ascii="Consolas" w:eastAsia="Consolas" w:hAnsi="Consolas" w:cs="Consolas"/>
+                <w:sz w:val="18"/>
+                <w:szCs w:val="18"/>
+              </w:rPr>
+              <w:t>POST /events/{id}/register</w:t>
+            </w:r>
+            <w:r>
+              <w:rPr>
+                <w:sz w:val="18"/>
+                <w:szCs w:val="18"/>
+              </w:rPr>
+              <w:t xml:space="preserve">, </w:t>
+            </w:r>
+            <w:r>
+              <w:rPr>
+                <w:rFonts w:ascii="Consolas" w:eastAsia="Consolas" w:hAnsi="Consolas" w:cs="Consolas"/>
+                <w:sz w:val="18"/>
+                <w:szCs w:val="18"/>
+              </w:rPr>
+              <w:t>DELETE /events/{id}/register</w:t>
+            </w:r>
+            <w:r>
+              <w:rPr>
+                <w:sz w:val="18"/>
+                <w:szCs w:val="18"/>
+              </w:rPr>
+              <w:t xml:space="preserve">, </w:t>
+            </w:r>
+            <w:r>
+              <w:rPr>
+                <w:rFonts w:ascii="Consolas" w:eastAsia="Consolas" w:hAnsi="Consolas" w:cs="Consolas"/>
+                <w:sz w:val="18"/>
+                <w:szCs w:val="18"/>
+              </w:rPr>
+              <w:t>GET /events/registrations/mine</w:t>
+            </w:r>
           </w:p>
         </w:tc>
         <w:tc>
@@ -14948,6 +15241,21 @@
                 <w:sz w:val="18"/>
                 <w:szCs w:val="18"/>
               </w:rPr>
+              <w:t>POST /transport/{id}/rate</w:t>
+            </w:r>
+            <w:r>
+              <w:rPr>
+                <w:sz w:val="18"/>
+                <w:szCs w:val="18"/>
+              </w:rPr>
+              <w:t xml:space="preserve">, </w:t>
+            </w:r>
+            <w:r>
+              <w:rPr>
+                <w:rFonts w:ascii="Consolas" w:eastAsia="Consolas" w:hAnsi="Consolas" w:cs="Consolas"/>
+                <w:sz w:val="18"/>
+                <w:szCs w:val="18"/>
+              </w:rPr>
               <w:t>POST</w:t>
             </w:r>
             <w:r>
@@ -15163,6 +15471,51 @@
               </w:rPr>
               <w:t>POST /notifications/{id}/read</w:t>
             </w:r>
+            <w:r>
+              <w:rPr>
+                <w:sz w:val="18"/>
+                <w:szCs w:val="18"/>
+              </w:rPr>
+              <w:t xml:space="preserve">, </w:t>
+            </w:r>
+            <w:r>
+              <w:rPr>
+                <w:rFonts w:ascii="Consolas" w:eastAsia="Consolas" w:hAnsi="Consolas" w:cs="Consolas"/>
+                <w:sz w:val="18"/>
+                <w:szCs w:val="18"/>
+              </w:rPr>
+              <w:t>GET/PUT /notifications/preferences</w:t>
+            </w:r>
+            <w:r>
+              <w:rPr>
+                <w:sz w:val="18"/>
+                <w:szCs w:val="18"/>
+              </w:rPr>
+              <w:t xml:space="preserve">, </w:t>
+            </w:r>
+            <w:r>
+              <w:rPr>
+                <w:rFonts w:ascii="Consolas" w:eastAsia="Consolas" w:hAnsi="Consolas" w:cs="Consolas"/>
+                <w:sz w:val="18"/>
+                <w:szCs w:val="18"/>
+              </w:rPr>
+              <w:t>POST /notifications/devices</w:t>
+            </w:r>
+            <w:r>
+              <w:rPr>
+                <w:sz w:val="18"/>
+                <w:szCs w:val="18"/>
+              </w:rPr>
+              <w:t xml:space="preserve">, </w:t>
+            </w:r>
+            <w:r>
+              <w:rPr>
+                <w:rFonts w:ascii="Consolas" w:eastAsia="Consolas" w:hAnsi="Consolas" w:cs="Consolas"/>
+                <w:sz w:val="18"/>
+                <w:szCs w:val="18"/>
+              </w:rPr>
+              <w:t>POST /notifications/devices/unregister</w:t>
+            </w:r>
           </w:p>
         </w:tc>
         <w:tc>
@@ -15241,10 +15594,18 @@
           <w:p>
             <w:r>
               <w:rPr>
-                <w:sz w:val="18"/>
-                <w:szCs w:val="18"/>
-              </w:rPr>
-              <w:t>Photo upload endpoint backed by Supabase Storage</w:t>
+                <w:rFonts w:ascii="Consolas" w:eastAsia="Consolas" w:hAnsi="Consolas" w:cs="Consolas"/>
+                <w:sz w:val="18"/>
+                <w:szCs w:val="18"/>
+              </w:rPr>
+              <w:t>POST /uploads</w:t>
+            </w:r>
+            <w:r>
+              <w:rPr>
+                <w:sz w:val="18"/>
+                <w:szCs w:val="18"/>
+              </w:rPr>
+              <w:t xml:space="preserve"> (photo stored in Supabase Storage, returns its public URL)</w:t>
             </w:r>
           </w:p>
         </w:tc>
@@ -15271,6 +15632,446 @@
                 <w:szCs w:val="18"/>
               </w:rPr>
               <w:t>Publisher</w:t>
+            </w:r>
+          </w:p>
+        </w:tc>
+      </w:tr>
+      <w:tr>
+        <w:trPr>
+          <w:cantSplit/>
+        </w:trPr>
+        <w:tc>
+          <w:tcPr>
+            <w:tcW w:w="1444" w:type="dxa"/>
+            <w:tcBorders>
+              <w:top w:val="single" w:sz="4" w:space="0" w:color="BFC8D2"/>
+              <w:left w:val="single" w:sz="4" w:space="0" w:color="BFC8D2"/>
+              <w:bottom w:val="single" w:sz="4" w:space="0" w:color="BFC8D2"/>
+              <w:right w:val="single" w:sz="4" w:space="0" w:color="BFC8D2"/>
+            </w:tcBorders>
+            <w:tcMar>
+              <w:top w:w="60" w:type="dxa"/>
+              <w:left w:w="100" w:type="dxa"/>
+              <w:bottom w:w="60" w:type="dxa"/>
+              <w:right w:w="100" w:type="dxa"/>
+            </w:tcMar>
+          </w:tcPr>
+          <w:p>
+            <w:r>
+              <w:rPr>
+                <w:sz w:val="18"/>
+                <w:szCs w:val="18"/>
+              </w:rPr>
+              <w:t>Internal</w:t>
+            </w:r>
+          </w:p>
+        </w:tc>
+        <w:tc>
+          <w:tcPr>
+            <w:tcW w:w="5235" w:type="dxa"/>
+            <w:tcBorders>
+              <w:top w:val="single" w:sz="4" w:space="0" w:color="BFC8D2"/>
+              <w:left w:val="single" w:sz="4" w:space="0" w:color="BFC8D2"/>
+              <w:bottom w:val="single" w:sz="4" w:space="0" w:color="BFC8D2"/>
+              <w:right w:val="single" w:sz="4" w:space="0" w:color="BFC8D2"/>
+            </w:tcBorders>
+            <w:tcMar>
+              <w:top w:w="60" w:type="dxa"/>
+              <w:left w:w="100" w:type="dxa"/>
+              <w:bottom w:w="60" w:type="dxa"/>
+              <w:right w:w="100" w:type="dxa"/>
+            </w:tcMar>
+          </w:tcPr>
+          <w:p>
+            <w:r>
+              <w:rPr>
+                <w:rFonts w:ascii="Consolas" w:eastAsia="Consolas" w:hAnsi="Consolas" w:cs="Consolas"/>
+                <w:sz w:val="18"/>
+                <w:szCs w:val="18"/>
+              </w:rPr>
+              <w:t>POST /internal/run-reminders</w:t>
+            </w:r>
+            <w:r>
+              <w:rPr>
+                <w:sz w:val="18"/>
+                <w:szCs w:val="18"/>
+              </w:rPr>
+              <w:t xml:space="preserve"> (X-Cron-Secret header; disabled when CRON_SECRET is unset)</w:t>
+            </w:r>
+          </w:p>
+        </w:tc>
+        <w:tc>
+          <w:tcPr>
+            <w:tcW w:w="2347" w:type="dxa"/>
+            <w:tcBorders>
+              <w:top w:val="single" w:sz="4" w:space="0" w:color="BFC8D2"/>
+              <w:left w:val="single" w:sz="4" w:space="0" w:color="BFC8D2"/>
+              <w:bottom w:val="single" w:sz="4" w:space="0" w:color="BFC8D2"/>
+              <w:right w:val="single" w:sz="4" w:space="0" w:color="BFC8D2"/>
+            </w:tcBorders>
+            <w:tcMar>
+              <w:top w:w="60" w:type="dxa"/>
+              <w:left w:w="100" w:type="dxa"/>
+              <w:bottom w:w="60" w:type="dxa"/>
+              <w:right w:w="100" w:type="dxa"/>
+            </w:tcMar>
+          </w:tcPr>
+          <w:p>
+            <w:r>
+              <w:rPr>
+                <w:sz w:val="18"/>
+                <w:szCs w:val="18"/>
+              </w:rPr>
+              <w:t>Scheduler only</w:t>
+            </w:r>
+          </w:p>
+        </w:tc>
+      </w:tr>
+      <w:tr>
+        <w:trPr>
+          <w:cantSplit/>
+        </w:trPr>
+        <w:tc>
+          <w:tcPr>
+            <w:tcW w:w="1444" w:type="dxa"/>
+            <w:tcBorders>
+              <w:top w:val="single" w:sz="4" w:space="0" w:color="BFC8D2"/>
+              <w:left w:val="single" w:sz="4" w:space="0" w:color="BFC8D2"/>
+              <w:bottom w:val="single" w:sz="4" w:space="0" w:color="BFC8D2"/>
+              <w:right w:val="single" w:sz="4" w:space="0" w:color="BFC8D2"/>
+            </w:tcBorders>
+            <w:tcMar>
+              <w:top w:w="60" w:type="dxa"/>
+              <w:left w:w="100" w:type="dxa"/>
+              <w:bottom w:w="60" w:type="dxa"/>
+              <w:right w:w="100" w:type="dxa"/>
+            </w:tcMar>
+          </w:tcPr>
+          <w:p>
+            <w:r>
+              <w:rPr>
+                <w:sz w:val="18"/>
+                <w:szCs w:val="18"/>
+              </w:rPr>
+              <w:t>Campus services</w:t>
+            </w:r>
+          </w:p>
+        </w:tc>
+        <w:tc>
+          <w:tcPr>
+            <w:tcW w:w="5235" w:type="dxa"/>
+            <w:tcBorders>
+              <w:top w:val="single" w:sz="4" w:space="0" w:color="BFC8D2"/>
+              <w:left w:val="single" w:sz="4" w:space="0" w:color="BFC8D2"/>
+              <w:bottom w:val="single" w:sz="4" w:space="0" w:color="BFC8D2"/>
+              <w:right w:val="single" w:sz="4" w:space="0" w:color="BFC8D2"/>
+            </w:tcBorders>
+            <w:tcMar>
+              <w:top w:w="60" w:type="dxa"/>
+              <w:left w:w="100" w:type="dxa"/>
+              <w:bottom w:w="60" w:type="dxa"/>
+              <w:right w:w="100" w:type="dxa"/>
+            </w:tcMar>
+          </w:tcPr>
+          <w:p>
+            <w:r>
+              <w:rPr>
+                <w:rFonts w:ascii="Consolas" w:eastAsia="Consolas" w:hAnsi="Consolas" w:cs="Consolas"/>
+                <w:sz w:val="18"/>
+                <w:szCs w:val="18"/>
+              </w:rPr>
+              <w:t>GET /campus-services</w:t>
+            </w:r>
+            <w:r>
+              <w:rPr>
+                <w:sz w:val="18"/>
+                <w:szCs w:val="18"/>
+              </w:rPr>
+              <w:t xml:space="preserve">, </w:t>
+            </w:r>
+            <w:r>
+              <w:rPr>
+                <w:rFonts w:ascii="Consolas" w:eastAsia="Consolas" w:hAnsi="Consolas" w:cs="Consolas"/>
+                <w:sz w:val="18"/>
+                <w:szCs w:val="18"/>
+              </w:rPr>
+              <w:t>POST</w:t>
+            </w:r>
+            <w:r>
+              <w:rPr>
+                <w:sz w:val="18"/>
+                <w:szCs w:val="18"/>
+              </w:rPr>
+              <w:t xml:space="preserve">, </w:t>
+            </w:r>
+            <w:r>
+              <w:rPr>
+                <w:rFonts w:ascii="Consolas" w:eastAsia="Consolas" w:hAnsi="Consolas" w:cs="Consolas"/>
+                <w:sz w:val="18"/>
+                <w:szCs w:val="18"/>
+              </w:rPr>
+              <w:t>DELETE /{id}</w:t>
+            </w:r>
+          </w:p>
+        </w:tc>
+        <w:tc>
+          <w:tcPr>
+            <w:tcW w:w="2347" w:type="dxa"/>
+            <w:tcBorders>
+              <w:top w:val="single" w:sz="4" w:space="0" w:color="BFC8D2"/>
+              <w:left w:val="single" w:sz="4" w:space="0" w:color="BFC8D2"/>
+              <w:bottom w:val="single" w:sz="4" w:space="0" w:color="BFC8D2"/>
+              <w:right w:val="single" w:sz="4" w:space="0" w:color="BFC8D2"/>
+            </w:tcBorders>
+            <w:tcMar>
+              <w:top w:w="60" w:type="dxa"/>
+              <w:left w:w="100" w:type="dxa"/>
+              <w:bottom w:w="60" w:type="dxa"/>
+              <w:right w:w="100" w:type="dxa"/>
+            </w:tcMar>
+          </w:tcPr>
+          <w:p>
+            <w:r>
+              <w:rPr>
+                <w:sz w:val="18"/>
+                <w:szCs w:val="18"/>
+              </w:rPr>
+              <w:t>Read: all. Write: publisher</w:t>
+            </w:r>
+          </w:p>
+        </w:tc>
+      </w:tr>
+      <w:tr>
+        <w:trPr>
+          <w:cantSplit/>
+        </w:trPr>
+        <w:tc>
+          <w:tcPr>
+            <w:tcW w:w="1444" w:type="dxa"/>
+            <w:tcBorders>
+              <w:top w:val="single" w:sz="4" w:space="0" w:color="BFC8D2"/>
+              <w:left w:val="single" w:sz="4" w:space="0" w:color="BFC8D2"/>
+              <w:bottom w:val="single" w:sz="4" w:space="0" w:color="BFC8D2"/>
+              <w:right w:val="single" w:sz="4" w:space="0" w:color="BFC8D2"/>
+            </w:tcBorders>
+            <w:tcMar>
+              <w:top w:w="60" w:type="dxa"/>
+              <w:left w:w="100" w:type="dxa"/>
+              <w:bottom w:w="60" w:type="dxa"/>
+              <w:right w:w="100" w:type="dxa"/>
+            </w:tcMar>
+          </w:tcPr>
+          <w:p>
+            <w:r>
+              <w:rPr>
+                <w:sz w:val="18"/>
+                <w:szCs w:val="18"/>
+              </w:rPr>
+              <w:t>Bookings</w:t>
+            </w:r>
+          </w:p>
+        </w:tc>
+        <w:tc>
+          <w:tcPr>
+            <w:tcW w:w="5235" w:type="dxa"/>
+            <w:tcBorders>
+              <w:top w:val="single" w:sz="4" w:space="0" w:color="BFC8D2"/>
+              <w:left w:val="single" w:sz="4" w:space="0" w:color="BFC8D2"/>
+              <w:bottom w:val="single" w:sz="4" w:space="0" w:color="BFC8D2"/>
+              <w:right w:val="single" w:sz="4" w:space="0" w:color="BFC8D2"/>
+            </w:tcBorders>
+            <w:tcMar>
+              <w:top w:w="60" w:type="dxa"/>
+              <w:left w:w="100" w:type="dxa"/>
+              <w:bottom w:w="60" w:type="dxa"/>
+              <w:right w:w="100" w:type="dxa"/>
+            </w:tcMar>
+          </w:tcPr>
+          <w:p>
+            <w:r>
+              <w:rPr>
+                <w:rFonts w:ascii="Consolas" w:eastAsia="Consolas" w:hAnsi="Consolas" w:cs="Consolas"/>
+                <w:sz w:val="18"/>
+                <w:szCs w:val="18"/>
+              </w:rPr>
+              <w:t>POST /bookings</w:t>
+            </w:r>
+            <w:r>
+              <w:rPr>
+                <w:sz w:val="18"/>
+                <w:szCs w:val="18"/>
+              </w:rPr>
+              <w:t xml:space="preserve">, </w:t>
+            </w:r>
+            <w:r>
+              <w:rPr>
+                <w:rFonts w:ascii="Consolas" w:eastAsia="Consolas" w:hAnsi="Consolas" w:cs="Consolas"/>
+                <w:sz w:val="18"/>
+                <w:szCs w:val="18"/>
+              </w:rPr>
+              <w:t>GET /bookings/mine</w:t>
+            </w:r>
+            <w:r>
+              <w:rPr>
+                <w:sz w:val="18"/>
+                <w:szCs w:val="18"/>
+              </w:rPr>
+              <w:t xml:space="preserve">, </w:t>
+            </w:r>
+            <w:r>
+              <w:rPr>
+                <w:rFonts w:ascii="Consolas" w:eastAsia="Consolas" w:hAnsi="Consolas" w:cs="Consolas"/>
+                <w:sz w:val="18"/>
+                <w:szCs w:val="18"/>
+              </w:rPr>
+              <w:t>GET /bookings/incoming</w:t>
+            </w:r>
+            <w:r>
+              <w:rPr>
+                <w:sz w:val="18"/>
+                <w:szCs w:val="18"/>
+              </w:rPr>
+              <w:t xml:space="preserve">, </w:t>
+            </w:r>
+            <w:r>
+              <w:rPr>
+                <w:rFonts w:ascii="Consolas" w:eastAsia="Consolas" w:hAnsi="Consolas" w:cs="Consolas"/>
+                <w:sz w:val="18"/>
+                <w:szCs w:val="18"/>
+              </w:rPr>
+              <w:t>POST /bookings/{id}/cancel</w:t>
+            </w:r>
+            <w:r>
+              <w:rPr>
+                <w:sz w:val="18"/>
+                <w:szCs w:val="18"/>
+              </w:rPr>
+              <w:t xml:space="preserve">, </w:t>
+            </w:r>
+            <w:r>
+              <w:rPr>
+                <w:rFonts w:ascii="Consolas" w:eastAsia="Consolas" w:hAnsi="Consolas" w:cs="Consolas"/>
+                <w:sz w:val="18"/>
+                <w:szCs w:val="18"/>
+              </w:rPr>
+              <w:t>POST /bookings/{id}/respond</w:t>
+            </w:r>
+          </w:p>
+        </w:tc>
+        <w:tc>
+          <w:tcPr>
+            <w:tcW w:w="2347" w:type="dxa"/>
+            <w:tcBorders>
+              <w:top w:val="single" w:sz="4" w:space="0" w:color="BFC8D2"/>
+              <w:left w:val="single" w:sz="4" w:space="0" w:color="BFC8D2"/>
+              <w:bottom w:val="single" w:sz="4" w:space="0" w:color="BFC8D2"/>
+              <w:right w:val="single" w:sz="4" w:space="0" w:color="BFC8D2"/>
+            </w:tcBorders>
+            <w:tcMar>
+              <w:top w:w="60" w:type="dxa"/>
+              <w:left w:w="100" w:type="dxa"/>
+              <w:bottom w:w="60" w:type="dxa"/>
+              <w:right w:w="100" w:type="dxa"/>
+            </w:tcMar>
+          </w:tcPr>
+          <w:p>
+            <w:r>
+              <w:rPr>
+                <w:sz w:val="18"/>
+                <w:szCs w:val="18"/>
+              </w:rPr>
+              <w:t>Student (create, cancel); rider owner (respond)</w:t>
+            </w:r>
+          </w:p>
+        </w:tc>
+      </w:tr>
+      <w:tr>
+        <w:trPr>
+          <w:cantSplit/>
+        </w:trPr>
+        <w:tc>
+          <w:tcPr>
+            <w:tcW w:w="1444" w:type="dxa"/>
+            <w:tcBorders>
+              <w:top w:val="single" w:sz="4" w:space="0" w:color="BFC8D2"/>
+              <w:left w:val="single" w:sz="4" w:space="0" w:color="BFC8D2"/>
+              <w:bottom w:val="single" w:sz="4" w:space="0" w:color="BFC8D2"/>
+              <w:right w:val="single" w:sz="4" w:space="0" w:color="BFC8D2"/>
+            </w:tcBorders>
+            <w:tcMar>
+              <w:top w:w="60" w:type="dxa"/>
+              <w:left w:w="100" w:type="dxa"/>
+              <w:bottom w:w="60" w:type="dxa"/>
+              <w:right w:w="100" w:type="dxa"/>
+            </w:tcMar>
+          </w:tcPr>
+          <w:p>
+            <w:r>
+              <w:rPr>
+                <w:sz w:val="18"/>
+                <w:szCs w:val="18"/>
+              </w:rPr>
+              <w:t>Search</w:t>
+            </w:r>
+          </w:p>
+        </w:tc>
+        <w:tc>
+          <w:tcPr>
+            <w:tcW w:w="5235" w:type="dxa"/>
+            <w:tcBorders>
+              <w:top w:val="single" w:sz="4" w:space="0" w:color="BFC8D2"/>
+              <w:left w:val="single" w:sz="4" w:space="0" w:color="BFC8D2"/>
+              <w:bottom w:val="single" w:sz="4" w:space="0" w:color="BFC8D2"/>
+              <w:right w:val="single" w:sz="4" w:space="0" w:color="BFC8D2"/>
+            </w:tcBorders>
+            <w:tcMar>
+              <w:top w:w="60" w:type="dxa"/>
+              <w:left w:w="100" w:type="dxa"/>
+              <w:bottom w:w="60" w:type="dxa"/>
+              <w:right w:w="100" w:type="dxa"/>
+            </w:tcMar>
+          </w:tcPr>
+          <w:p>
+            <w:r>
+              <w:rPr>
+                <w:rFonts w:ascii="Consolas" w:eastAsia="Consolas" w:hAnsi="Consolas" w:cs="Consolas"/>
+                <w:sz w:val="18"/>
+                <w:szCs w:val="18"/>
+              </w:rPr>
+              <w:t>GET /search?q=</w:t>
+            </w:r>
+            <w:r>
+              <w:rPr>
+                <w:sz w:val="18"/>
+                <w:szCs w:val="18"/>
+              </w:rPr>
+              <w:t xml:space="preserve"> (announcements, events, accommodation, boda riders)</w:t>
+            </w:r>
+          </w:p>
+        </w:tc>
+        <w:tc>
+          <w:tcPr>
+            <w:tcW w:w="2347" w:type="dxa"/>
+            <w:tcBorders>
+              <w:top w:val="single" w:sz="4" w:space="0" w:color="BFC8D2"/>
+              <w:left w:val="single" w:sz="4" w:space="0" w:color="BFC8D2"/>
+              <w:bottom w:val="single" w:sz="4" w:space="0" w:color="BFC8D2"/>
+              <w:right w:val="single" w:sz="4" w:space="0" w:color="BFC8D2"/>
+            </w:tcBorders>
+            <w:tcMar>
+              <w:top w:w="60" w:type="dxa"/>
+              <w:left w:w="100" w:type="dxa"/>
+              <w:bottom w:w="60" w:type="dxa"/>
+              <w:right w:w="100" w:type="dxa"/>
+            </w:tcMar>
+          </w:tcPr>
+          <w:p>
+            <w:r>
+              <w:rPr>
+                <w:sz w:val="18"/>
+                <w:szCs w:val="18"/>
+              </w:rPr>
+              <w:t>Any user</w:t>
             </w:r>
           </w:p>
         </w:tc>
@@ -15833,7 +16634,7 @@
                 <w:sz w:val="18"/>
                 <w:szCs w:val="18"/>
               </w:rPr>
-              <w:t>id (FK auth.users), name, email, role, student_id, faculty, program, image_url</w:t>
+              <w:t>id (FK auth.users), name, email, role, student_id, faculty, program, image_url, notification_prefs (jsonb)</w:t>
             </w:r>
           </w:p>
         </w:tc>
@@ -15917,7 +16718,7 @@
                 <w:sz w:val="18"/>
                 <w:szCs w:val="18"/>
               </w:rPr>
-              <w:t>title, description, category, publisher_name, published_at, is_important, image_url, expires_at</w:t>
+              <w:t>title, description, category, publisher_name, published_at, is_important, image_url, expires_at, publish_at, notified_at</w:t>
             </w:r>
           </w:p>
         </w:tc>
@@ -16001,7 +16802,7 @@
                 <w:sz w:val="18"/>
                 <w:szCs w:val="18"/>
               </w:rPr>
-              <w:t>title, description, category, organizer_name, date_time, end_date_time, venue, image_url, capacity, registered_count, is_featured</w:t>
+              <w:t>title, description, category, organizer_name, date_time, end_date_time, venue, image_url, capacity, registered_count, is_featured, publish_at, notified_at</w:t>
             </w:r>
           </w:p>
         </w:tc>
@@ -16506,6 +17307,510 @@
                 <w:szCs w:val="18"/>
               </w:rPr>
               <w:t>user_id, title, body, type, related_id, is_read</w:t>
+            </w:r>
+          </w:p>
+        </w:tc>
+      </w:tr>
+      <w:tr>
+        <w:trPr>
+          <w:cantSplit/>
+        </w:trPr>
+        <w:tc>
+          <w:tcPr>
+            <w:tcW w:w="2166" w:type="dxa"/>
+            <w:tcBorders>
+              <w:top w:val="single" w:sz="4" w:space="0" w:color="BFC8D2"/>
+              <w:left w:val="single" w:sz="4" w:space="0" w:color="BFC8D2"/>
+              <w:bottom w:val="single" w:sz="4" w:space="0" w:color="BFC8D2"/>
+              <w:right w:val="single" w:sz="4" w:space="0" w:color="BFC8D2"/>
+            </w:tcBorders>
+            <w:tcMar>
+              <w:top w:w="60" w:type="dxa"/>
+              <w:left w:w="100" w:type="dxa"/>
+              <w:bottom w:w="60" w:type="dxa"/>
+              <w:right w:w="100" w:type="dxa"/>
+            </w:tcMar>
+          </w:tcPr>
+          <w:p>
+            <w:r>
+              <w:rPr>
+                <w:rFonts w:ascii="Consolas" w:eastAsia="Consolas" w:hAnsi="Consolas" w:cs="Consolas"/>
+                <w:sz w:val="18"/>
+                <w:szCs w:val="18"/>
+              </w:rPr>
+              <w:t>event_reminders_sent</w:t>
+            </w:r>
+          </w:p>
+        </w:tc>
+        <w:tc>
+          <w:tcPr>
+            <w:tcW w:w="3069" w:type="dxa"/>
+            <w:tcBorders>
+              <w:top w:val="single" w:sz="4" w:space="0" w:color="BFC8D2"/>
+              <w:left w:val="single" w:sz="4" w:space="0" w:color="BFC8D2"/>
+              <w:bottom w:val="single" w:sz="4" w:space="0" w:color="BFC8D2"/>
+              <w:right w:val="single" w:sz="4" w:space="0" w:color="BFC8D2"/>
+            </w:tcBorders>
+            <w:tcMar>
+              <w:top w:w="60" w:type="dxa"/>
+              <w:left w:w="100" w:type="dxa"/>
+              <w:bottom w:w="60" w:type="dxa"/>
+              <w:right w:w="100" w:type="dxa"/>
+            </w:tcMar>
+          </w:tcPr>
+          <w:p>
+            <w:r>
+              <w:rPr>
+                <w:sz w:val="18"/>
+                <w:szCs w:val="18"/>
+              </w:rPr>
+              <w:t>Claim table that guarantees one reminder per user, event and kind</w:t>
+            </w:r>
+          </w:p>
+        </w:tc>
+        <w:tc>
+          <w:tcPr>
+            <w:tcW w:w="3791" w:type="dxa"/>
+            <w:tcBorders>
+              <w:top w:val="single" w:sz="4" w:space="0" w:color="BFC8D2"/>
+              <w:left w:val="single" w:sz="4" w:space="0" w:color="BFC8D2"/>
+              <w:bottom w:val="single" w:sz="4" w:space="0" w:color="BFC8D2"/>
+              <w:right w:val="single" w:sz="4" w:space="0" w:color="BFC8D2"/>
+            </w:tcBorders>
+            <w:tcMar>
+              <w:top w:w="60" w:type="dxa"/>
+              <w:left w:w="100" w:type="dxa"/>
+              <w:bottom w:w="60" w:type="dxa"/>
+              <w:right w:w="100" w:type="dxa"/>
+            </w:tcMar>
+          </w:tcPr>
+          <w:p>
+            <w:r>
+              <w:rPr>
+                <w:sz w:val="18"/>
+                <w:szCs w:val="18"/>
+              </w:rPr>
+              <w:t>event_id, user_id, kind (day, hour); primary key on all three</w:t>
+            </w:r>
+          </w:p>
+        </w:tc>
+      </w:tr>
+      <w:tr>
+        <w:trPr>
+          <w:cantSplit/>
+        </w:trPr>
+        <w:tc>
+          <w:tcPr>
+            <w:tcW w:w="2166" w:type="dxa"/>
+            <w:tcBorders>
+              <w:top w:val="single" w:sz="4" w:space="0" w:color="BFC8D2"/>
+              <w:left w:val="single" w:sz="4" w:space="0" w:color="BFC8D2"/>
+              <w:bottom w:val="single" w:sz="4" w:space="0" w:color="BFC8D2"/>
+              <w:right w:val="single" w:sz="4" w:space="0" w:color="BFC8D2"/>
+            </w:tcBorders>
+            <w:tcMar>
+              <w:top w:w="60" w:type="dxa"/>
+              <w:left w:w="100" w:type="dxa"/>
+              <w:bottom w:w="60" w:type="dxa"/>
+              <w:right w:w="100" w:type="dxa"/>
+            </w:tcMar>
+          </w:tcPr>
+          <w:p>
+            <w:r>
+              <w:rPr>
+                <w:rFonts w:ascii="Consolas" w:eastAsia="Consolas" w:hAnsi="Consolas" w:cs="Consolas"/>
+                <w:sz w:val="18"/>
+                <w:szCs w:val="18"/>
+              </w:rPr>
+              <w:t>device_tokens</w:t>
+            </w:r>
+          </w:p>
+        </w:tc>
+        <w:tc>
+          <w:tcPr>
+            <w:tcW w:w="3069" w:type="dxa"/>
+            <w:tcBorders>
+              <w:top w:val="single" w:sz="4" w:space="0" w:color="BFC8D2"/>
+              <w:left w:val="single" w:sz="4" w:space="0" w:color="BFC8D2"/>
+              <w:bottom w:val="single" w:sz="4" w:space="0" w:color="BFC8D2"/>
+              <w:right w:val="single" w:sz="4" w:space="0" w:color="BFC8D2"/>
+            </w:tcBorders>
+            <w:tcMar>
+              <w:top w:w="60" w:type="dxa"/>
+              <w:left w:w="100" w:type="dxa"/>
+              <w:bottom w:w="60" w:type="dxa"/>
+              <w:right w:w="100" w:type="dxa"/>
+            </w:tcMar>
+          </w:tcPr>
+          <w:p>
+            <w:r>
+              <w:rPr>
+                <w:sz w:val="18"/>
+                <w:szCs w:val="18"/>
+              </w:rPr>
+              <w:t>FCM registration tokens per device</w:t>
+            </w:r>
+          </w:p>
+        </w:tc>
+        <w:tc>
+          <w:tcPr>
+            <w:tcW w:w="3791" w:type="dxa"/>
+            <w:tcBorders>
+              <w:top w:val="single" w:sz="4" w:space="0" w:color="BFC8D2"/>
+              <w:left w:val="single" w:sz="4" w:space="0" w:color="BFC8D2"/>
+              <w:bottom w:val="single" w:sz="4" w:space="0" w:color="BFC8D2"/>
+              <w:right w:val="single" w:sz="4" w:space="0" w:color="BFC8D2"/>
+            </w:tcBorders>
+            <w:tcMar>
+              <w:top w:w="60" w:type="dxa"/>
+              <w:left w:w="100" w:type="dxa"/>
+              <w:bottom w:w="60" w:type="dxa"/>
+              <w:right w:w="100" w:type="dxa"/>
+            </w:tcMar>
+          </w:tcPr>
+          <w:p>
+            <w:r>
+              <w:rPr>
+                <w:sz w:val="18"/>
+                <w:szCs w:val="18"/>
+              </w:rPr>
+              <w:t>user_id, token (unique), platform</w:t>
+            </w:r>
+          </w:p>
+        </w:tc>
+      </w:tr>
+      <w:tr>
+        <w:trPr>
+          <w:cantSplit/>
+        </w:trPr>
+        <w:tc>
+          <w:tcPr>
+            <w:tcW w:w="2166" w:type="dxa"/>
+            <w:tcBorders>
+              <w:top w:val="single" w:sz="4" w:space="0" w:color="BFC8D2"/>
+              <w:left w:val="single" w:sz="4" w:space="0" w:color="BFC8D2"/>
+              <w:bottom w:val="single" w:sz="4" w:space="0" w:color="BFC8D2"/>
+              <w:right w:val="single" w:sz="4" w:space="0" w:color="BFC8D2"/>
+            </w:tcBorders>
+            <w:tcMar>
+              <w:top w:w="60" w:type="dxa"/>
+              <w:left w:w="100" w:type="dxa"/>
+              <w:bottom w:w="60" w:type="dxa"/>
+              <w:right w:w="100" w:type="dxa"/>
+            </w:tcMar>
+          </w:tcPr>
+          <w:p>
+            <w:r>
+              <w:rPr>
+                <w:rFonts w:ascii="Consolas" w:eastAsia="Consolas" w:hAnsi="Consolas" w:cs="Consolas"/>
+                <w:sz w:val="18"/>
+                <w:szCs w:val="18"/>
+              </w:rPr>
+              <w:t>campus_services</w:t>
+            </w:r>
+          </w:p>
+        </w:tc>
+        <w:tc>
+          <w:tcPr>
+            <w:tcW w:w="3069" w:type="dxa"/>
+            <w:tcBorders>
+              <w:top w:val="single" w:sz="4" w:space="0" w:color="BFC8D2"/>
+              <w:left w:val="single" w:sz="4" w:space="0" w:color="BFC8D2"/>
+              <w:bottom w:val="single" w:sz="4" w:space="0" w:color="BFC8D2"/>
+              <w:right w:val="single" w:sz="4" w:space="0" w:color="BFC8D2"/>
+            </w:tcBorders>
+            <w:tcMar>
+              <w:top w:w="60" w:type="dxa"/>
+              <w:left w:w="100" w:type="dxa"/>
+              <w:bottom w:w="60" w:type="dxa"/>
+              <w:right w:w="100" w:type="dxa"/>
+            </w:tcMar>
+          </w:tcPr>
+          <w:p>
+            <w:r>
+              <w:rPr>
+                <w:sz w:val="18"/>
+                <w:szCs w:val="18"/>
+              </w:rPr>
+              <w:t>Generic campus service directory</w:t>
+            </w:r>
+          </w:p>
+        </w:tc>
+        <w:tc>
+          <w:tcPr>
+            <w:tcW w:w="3791" w:type="dxa"/>
+            <w:tcBorders>
+              <w:top w:val="single" w:sz="4" w:space="0" w:color="BFC8D2"/>
+              <w:left w:val="single" w:sz="4" w:space="0" w:color="BFC8D2"/>
+              <w:bottom w:val="single" w:sz="4" w:space="0" w:color="BFC8D2"/>
+              <w:right w:val="single" w:sz="4" w:space="0" w:color="BFC8D2"/>
+            </w:tcBorders>
+            <w:tcMar>
+              <w:top w:w="60" w:type="dxa"/>
+              <w:left w:w="100" w:type="dxa"/>
+              <w:bottom w:w="60" w:type="dxa"/>
+              <w:right w:w="100" w:type="dxa"/>
+            </w:tcMar>
+          </w:tcPr>
+          <w:p>
+            <w:r>
+              <w:rPr>
+                <w:sz w:val="18"/>
+                <w:szCs w:val="18"/>
+              </w:rPr>
+              <w:t>category (food, health, it_support, library), name, description, location, opening_hours, contact_phone</w:t>
+            </w:r>
+          </w:p>
+        </w:tc>
+      </w:tr>
+      <w:tr>
+        <w:trPr>
+          <w:cantSplit/>
+        </w:trPr>
+        <w:tc>
+          <w:tcPr>
+            <w:tcW w:w="2166" w:type="dxa"/>
+            <w:tcBorders>
+              <w:top w:val="single" w:sz="4" w:space="0" w:color="BFC8D2"/>
+              <w:left w:val="single" w:sz="4" w:space="0" w:color="BFC8D2"/>
+              <w:bottom w:val="single" w:sz="4" w:space="0" w:color="BFC8D2"/>
+              <w:right w:val="single" w:sz="4" w:space="0" w:color="BFC8D2"/>
+            </w:tcBorders>
+            <w:tcMar>
+              <w:top w:w="60" w:type="dxa"/>
+              <w:left w:w="100" w:type="dxa"/>
+              <w:bottom w:w="60" w:type="dxa"/>
+              <w:right w:w="100" w:type="dxa"/>
+            </w:tcMar>
+          </w:tcPr>
+          <w:p>
+            <w:r>
+              <w:rPr>
+                <w:rFonts w:ascii="Consolas" w:eastAsia="Consolas" w:hAnsi="Consolas" w:cs="Consolas"/>
+                <w:sz w:val="18"/>
+                <w:szCs w:val="18"/>
+              </w:rPr>
+              <w:t>bookings</w:t>
+            </w:r>
+          </w:p>
+        </w:tc>
+        <w:tc>
+          <w:tcPr>
+            <w:tcW w:w="3069" w:type="dxa"/>
+            <w:tcBorders>
+              <w:top w:val="single" w:sz="4" w:space="0" w:color="BFC8D2"/>
+              <w:left w:val="single" w:sz="4" w:space="0" w:color="BFC8D2"/>
+              <w:bottom w:val="single" w:sz="4" w:space="0" w:color="BFC8D2"/>
+              <w:right w:val="single" w:sz="4" w:space="0" w:color="BFC8D2"/>
+            </w:tcBorders>
+            <w:tcMar>
+              <w:top w:w="60" w:type="dxa"/>
+              <w:left w:w="100" w:type="dxa"/>
+              <w:bottom w:w="60" w:type="dxa"/>
+              <w:right w:w="100" w:type="dxa"/>
+            </w:tcMar>
+          </w:tcPr>
+          <w:p>
+            <w:r>
+              <w:rPr>
+                <w:sz w:val="18"/>
+                <w:szCs w:val="18"/>
+              </w:rPr>
+              <w:t>Boda booking requests</w:t>
+            </w:r>
+          </w:p>
+        </w:tc>
+        <w:tc>
+          <w:tcPr>
+            <w:tcW w:w="3791" w:type="dxa"/>
+            <w:tcBorders>
+              <w:top w:val="single" w:sz="4" w:space="0" w:color="BFC8D2"/>
+              <w:left w:val="single" w:sz="4" w:space="0" w:color="BFC8D2"/>
+              <w:bottom w:val="single" w:sz="4" w:space="0" w:color="BFC8D2"/>
+              <w:right w:val="single" w:sz="4" w:space="0" w:color="BFC8D2"/>
+            </w:tcBorders>
+            <w:tcMar>
+              <w:top w:w="60" w:type="dxa"/>
+              <w:left w:w="100" w:type="dxa"/>
+              <w:bottom w:w="60" w:type="dxa"/>
+              <w:right w:w="100" w:type="dxa"/>
+            </w:tcMar>
+          </w:tcPr>
+          <w:p>
+            <w:r>
+              <w:rPr>
+                <w:sz w:val="18"/>
+                <w:szCs w:val="18"/>
+              </w:rPr>
+              <w:t>student_id, provider_id, pickup, destination, requested_time, status (pending, accepted, declined, cancelled, completed)</w:t>
+            </w:r>
+          </w:p>
+        </w:tc>
+      </w:tr>
+      <w:tr>
+        <w:trPr>
+          <w:cantSplit/>
+        </w:trPr>
+        <w:tc>
+          <w:tcPr>
+            <w:tcW w:w="2166" w:type="dxa"/>
+            <w:tcBorders>
+              <w:top w:val="single" w:sz="4" w:space="0" w:color="BFC8D2"/>
+              <w:left w:val="single" w:sz="4" w:space="0" w:color="BFC8D2"/>
+              <w:bottom w:val="single" w:sz="4" w:space="0" w:color="BFC8D2"/>
+              <w:right w:val="single" w:sz="4" w:space="0" w:color="BFC8D2"/>
+            </w:tcBorders>
+            <w:tcMar>
+              <w:top w:w="60" w:type="dxa"/>
+              <w:left w:w="100" w:type="dxa"/>
+              <w:bottom w:w="60" w:type="dxa"/>
+              <w:right w:w="100" w:type="dxa"/>
+            </w:tcMar>
+          </w:tcPr>
+          <w:p>
+            <w:r>
+              <w:rPr>
+                <w:rFonts w:ascii="Consolas" w:eastAsia="Consolas" w:hAnsi="Consolas" w:cs="Consolas"/>
+                <w:sz w:val="18"/>
+                <w:szCs w:val="18"/>
+              </w:rPr>
+              <w:t>transport_ratings</w:t>
+            </w:r>
+          </w:p>
+        </w:tc>
+        <w:tc>
+          <w:tcPr>
+            <w:tcW w:w="3069" w:type="dxa"/>
+            <w:tcBorders>
+              <w:top w:val="single" w:sz="4" w:space="0" w:color="BFC8D2"/>
+              <w:left w:val="single" w:sz="4" w:space="0" w:color="BFC8D2"/>
+              <w:bottom w:val="single" w:sz="4" w:space="0" w:color="BFC8D2"/>
+              <w:right w:val="single" w:sz="4" w:space="0" w:color="BFC8D2"/>
+            </w:tcBorders>
+            <w:tcMar>
+              <w:top w:w="60" w:type="dxa"/>
+              <w:left w:w="100" w:type="dxa"/>
+              <w:bottom w:w="60" w:type="dxa"/>
+              <w:right w:w="100" w:type="dxa"/>
+            </w:tcMar>
+          </w:tcPr>
+          <w:p>
+            <w:r>
+              <w:rPr>
+                <w:sz w:val="18"/>
+                <w:szCs w:val="18"/>
+              </w:rPr>
+              <w:t>One star rating per student per rider</w:t>
+            </w:r>
+          </w:p>
+        </w:tc>
+        <w:tc>
+          <w:tcPr>
+            <w:tcW w:w="3791" w:type="dxa"/>
+            <w:tcBorders>
+              <w:top w:val="single" w:sz="4" w:space="0" w:color="BFC8D2"/>
+              <w:left w:val="single" w:sz="4" w:space="0" w:color="BFC8D2"/>
+              <w:bottom w:val="single" w:sz="4" w:space="0" w:color="BFC8D2"/>
+              <w:right w:val="single" w:sz="4" w:space="0" w:color="BFC8D2"/>
+            </w:tcBorders>
+            <w:tcMar>
+              <w:top w:w="60" w:type="dxa"/>
+              <w:left w:w="100" w:type="dxa"/>
+              <w:bottom w:w="60" w:type="dxa"/>
+              <w:right w:w="100" w:type="dxa"/>
+            </w:tcMar>
+          </w:tcPr>
+          <w:p>
+            <w:r>
+              <w:rPr>
+                <w:sz w:val="18"/>
+                <w:szCs w:val="18"/>
+              </w:rPr>
+              <w:t>provider_id, user_id, stars; updates rating and rating_count</w:t>
+            </w:r>
+          </w:p>
+        </w:tc>
+      </w:tr>
+      <w:tr>
+        <w:trPr>
+          <w:cantSplit/>
+        </w:trPr>
+        <w:tc>
+          <w:tcPr>
+            <w:tcW w:w="2166" w:type="dxa"/>
+            <w:tcBorders>
+              <w:top w:val="single" w:sz="4" w:space="0" w:color="BFC8D2"/>
+              <w:left w:val="single" w:sz="4" w:space="0" w:color="BFC8D2"/>
+              <w:bottom w:val="single" w:sz="4" w:space="0" w:color="BFC8D2"/>
+              <w:right w:val="single" w:sz="4" w:space="0" w:color="BFC8D2"/>
+            </w:tcBorders>
+            <w:tcMar>
+              <w:top w:w="60" w:type="dxa"/>
+              <w:left w:w="100" w:type="dxa"/>
+              <w:bottom w:w="60" w:type="dxa"/>
+              <w:right w:w="100" w:type="dxa"/>
+            </w:tcMar>
+          </w:tcPr>
+          <w:p>
+            <w:r>
+              <w:rPr>
+                <w:rFonts w:ascii="Consolas" w:eastAsia="Consolas" w:hAnsi="Consolas" w:cs="Consolas"/>
+                <w:sz w:val="18"/>
+                <w:szCs w:val="18"/>
+              </w:rPr>
+              <w:t>event_registrations</w:t>
+            </w:r>
+          </w:p>
+        </w:tc>
+        <w:tc>
+          <w:tcPr>
+            <w:tcW w:w="3069" w:type="dxa"/>
+            <w:tcBorders>
+              <w:top w:val="single" w:sz="4" w:space="0" w:color="BFC8D2"/>
+              <w:left w:val="single" w:sz="4" w:space="0" w:color="BFC8D2"/>
+              <w:bottom w:val="single" w:sz="4" w:space="0" w:color="BFC8D2"/>
+              <w:right w:val="single" w:sz="4" w:space="0" w:color="BFC8D2"/>
+            </w:tcBorders>
+            <w:tcMar>
+              <w:top w:w="60" w:type="dxa"/>
+              <w:left w:w="100" w:type="dxa"/>
+              <w:bottom w:w="60" w:type="dxa"/>
+              <w:right w:w="100" w:type="dxa"/>
+            </w:tcMar>
+          </w:tcPr>
+          <w:p>
+            <w:r>
+              <w:rPr>
+                <w:sz w:val="18"/>
+                <w:szCs w:val="18"/>
+              </w:rPr>
+              <w:t>Who registered for which event</w:t>
+            </w:r>
+          </w:p>
+        </w:tc>
+        <w:tc>
+          <w:tcPr>
+            <w:tcW w:w="3791" w:type="dxa"/>
+            <w:tcBorders>
+              <w:top w:val="single" w:sz="4" w:space="0" w:color="BFC8D2"/>
+              <w:left w:val="single" w:sz="4" w:space="0" w:color="BFC8D2"/>
+              <w:bottom w:val="single" w:sz="4" w:space="0" w:color="BFC8D2"/>
+              <w:right w:val="single" w:sz="4" w:space="0" w:color="BFC8D2"/>
+            </w:tcBorders>
+            <w:tcMar>
+              <w:top w:w="60" w:type="dxa"/>
+              <w:left w:w="100" w:type="dxa"/>
+              <w:bottom w:w="60" w:type="dxa"/>
+              <w:right w:w="100" w:type="dxa"/>
+            </w:tcMar>
+          </w:tcPr>
+          <w:p>
+            <w:r>
+              <w:rPr>
+                <w:sz w:val="18"/>
+                <w:szCs w:val="18"/>
+              </w:rPr>
+              <w:t>event_id, user_id; drives registered_count</w:t>
             </w:r>
           </w:p>
         </w:tc>
@@ -17200,7 +18505,7 @@
                 <w:sz w:val="18"/>
                 <w:szCs w:val="18"/>
               </w:rPr>
-              <w:t>Personal data shall be retained only while the account is active. Inactive accounts older than two years should be removed.</w:t>
+              <w:t>Personal data shall be retained only while the account is active. Student accounts not seen for two years are removed by a scheduled purge job (POST /internal/purge-inactive).</w:t>
             </w:r>
           </w:p>
         </w:tc>
@@ -17252,7 +18557,7 @@
                 <w:sz w:val="18"/>
                 <w:szCs w:val="18"/>
               </w:rPr>
-              <w:t>Planned</w:t>
+              <w:t>Built</w:t>
             </w:r>
           </w:p>
         </w:tc>
@@ -18974,7 +20279,7 @@
                 <w:sz w:val="18"/>
                 <w:szCs w:val="18"/>
               </w:rPr>
-              <w:t>Admin sessions shall time out after 30 minutes of inactivity and admin accounts shall require 2FA.</w:t>
+              <w:t>Admin sessions shall time out after 30 minutes of inactivity (including time in the background), and admin accounts shall be able to require two-factor authentication.</w:t>
             </w:r>
           </w:p>
         </w:tc>
@@ -19026,7 +20331,7 @@
                 <w:sz w:val="18"/>
                 <w:szCs w:val="18"/>
               </w:rPr>
-              <w:t>Planned</w:t>
+              <w:t>Built</w:t>
             </w:r>
           </w:p>
         </w:tc>
@@ -19083,7 +20388,7 @@
                 <w:sz w:val="18"/>
                 <w:szCs w:val="18"/>
               </w:rPr>
-              <w:t>Account lockout after 5 failed logins shall be applied (Supabase default behaviour to be confirmed in project settings).</w:t>
+              <w:t>Account lockout shall apply after 5 failed logins for the same email within 15 minutes (HTTP 429); per-IP limits and Supabase's own limits also apply.</w:t>
             </w:r>
           </w:p>
         </w:tc>
@@ -19135,7 +20440,7 @@
                 <w:sz w:val="18"/>
                 <w:szCs w:val="18"/>
               </w:rPr>
-              <w:t>Partial</w:t>
+              <w:t>Built</w:t>
             </w:r>
           </w:p>
         </w:tc>
@@ -19785,7 +21090,7 @@
                 <w:sz w:val="18"/>
                 <w:szCs w:val="18"/>
               </w:rPr>
-              <w:t>Recovery time objective 4 hours; recovery point objective 6 hours.</w:t>
+              <w:t>Recovery time objective 4 hours; recovery point objective 6 hours. A backup script and restore runbook exist (docs/OPERATIONS.md); the restore has not yet been tested.</w:t>
             </w:r>
           </w:p>
         </w:tc>
@@ -19837,7 +21142,7 @@
                 <w:sz w:val="18"/>
                 <w:szCs w:val="18"/>
               </w:rPr>
-              <w:t>Planned</w:t>
+              <w:t>Partial</w:t>
             </w:r>
           </w:p>
         </w:tc>
@@ -20463,7 +21768,7 @@
                 <w:sz w:val="18"/>
                 <w:szCs w:val="18"/>
               </w:rPr>
-              <w:t>No 2FA on admin accounts</w:t>
+              <w:t>Admin accounts not yet enrolled in 2FA</w:t>
             </w:r>
           </w:p>
         </w:tc>
@@ -20515,7 +21820,7 @@
                 <w:sz w:val="18"/>
                 <w:szCs w:val="18"/>
               </w:rPr>
-              <w:t>Enable Supabase MFA before public launch</w:t>
+              <w:t>Enrol every admin, then set ADMIN_REQUIRE_2FA=true (docs/OPERATIONS.md)</w:t>
             </w:r>
           </w:p>
         </w:tc>
@@ -20712,7 +22017,7 @@
                 <w:sz w:val="18"/>
                 <w:szCs w:val="18"/>
               </w:rPr>
-              <w:t>Illustrative analytics mistaken for real data</w:t>
+              <w:t>Nominal health figures mistaken for measurements</w:t>
             </w:r>
           </w:p>
         </w:tc>
@@ -20764,7 +22069,7 @@
                 <w:sz w:val="18"/>
                 <w:szCs w:val="18"/>
               </w:rPr>
-              <w:t>Add usage tracking; label sample figures until then</w:t>
+              <w:t>Usage figures are real; add real database and storage health probes</w:t>
             </w:r>
           </w:p>
         </w:tc>
@@ -20796,7 +22101,7 @@
         <w:spacing w:after="60"/>
       </w:pPr>
       <w:r>
-        <w:t>Two-factor authentication and a general audit log</w:t>
+        <w:t>Audit entries for sign-ins (today only administrator actions are logged)</w:t>
       </w:r>
     </w:p>
     <w:p>
@@ -20809,7 +22114,7 @@
         <w:spacing w:after="60"/>
       </w:pPr>
       <w:r>
-        <w:t>Push notifications and event reminders</w:t>
+        <w:t>On-device verification of push notifications and event reminders</w:t>
       </w:r>
     </w:p>
     <w:p>
@@ -20822,7 +22127,7 @@
         <w:spacing w:after="60"/>
       </w:pPr>
       <w:r>
-        <w:t>Usage tracking for real DAU/MAU, views and engagement</w:t>
+        <w:t>Per-screen usage analytics beyond views and last-seen</w:t>
       </w:r>
     </w:p>
     <w:p>
@@ -20835,7 +22140,7 @@
         <w:spacing w:after="60"/>
       </w:pPr>
       <w:r>
-        <w:t>Scheduled posting, content reporting by students, rating of riders</w:t>
+        <w:t>Content reporting by students</w:t>
       </w:r>
     </w:p>
     <w:p>
@@ -20861,7 +22166,7 @@
         <w:spacing w:after="60"/>
       </w:pPr>
       <w:r>
-        <w:t>University SSO, iOS build, in-app booking, additional services</w:t>
+        <w:t>University SSO, iOS build, payments, dedicated modules for additional services</w:t>
       </w:r>
     </w:p>
     <w:p>
@@ -22595,7 +23900,7 @@
         <w:spacing w:after="120"/>
       </w:pPr>
       <w:r>
-        <w:t>Core flows (authentication, feed, events, services, bookmarks, publishing with drafts and photo upload, remove-only moderation, role management) are built and run against a live Supabase project. The items below are the open gaps against this specification.</w:t>
+        <w:t>Core flows (authentication, feed, events with registration and reminders, services with ratings and bookings, search, bookmarks, publishing with drafts, photo upload and scheduling, push notifications, remove-only moderation, role management) are built and run against a live Supabase project. The items below are the open gaps against this specification.</w:t>
       </w:r>
     </w:p>
     <w:tbl>
@@ -22761,7 +24066,7 @@
                 <w:sz w:val="18"/>
                 <w:szCs w:val="18"/>
               </w:rPr>
-              <w:t>2FA, admin session timeout, confirm lockout policy</w:t>
+              <w:t>Enrol every admin in 2FA before enforcing it; confirm Supabase rate limits</w:t>
             </w:r>
           </w:p>
         </w:tc>
@@ -22787,7 +24092,7 @@
                 <w:sz w:val="18"/>
                 <w:szCs w:val="18"/>
               </w:rPr>
-              <w:t>FR-AUTH-07, NFR-SEC-09, NFR-SEC-10</w:t>
+              <w:t>FR-AUTH-07, NFR-SEC-10</w:t>
             </w:r>
           </w:p>
         </w:tc>
@@ -22844,7 +24149,7 @@
                 <w:sz w:val="18"/>
                 <w:szCs w:val="18"/>
               </w:rPr>
-              <w:t>Password reset UI, data export and deletion</w:t>
+              <w:t>Set the Supabase Site URL for the reset link</w:t>
             </w:r>
           </w:p>
         </w:tc>
@@ -22870,7 +24175,7 @@
                 <w:sz w:val="18"/>
                 <w:szCs w:val="18"/>
               </w:rPr>
-              <w:t>FR-AUTH-06, FR-AUTH-08</w:t>
+              <w:t>FR-AUTH-06</w:t>
             </w:r>
           </w:p>
         </w:tc>
@@ -22927,7 +24232,7 @@
                 <w:sz w:val="18"/>
                 <w:szCs w:val="18"/>
               </w:rPr>
-              <w:t>Push delivery, removal notices, event reminders</w:t>
+              <w:t>On-device push verification</w:t>
             </w:r>
           </w:p>
         </w:tc>
@@ -22953,7 +24258,7 @@
                 <w:sz w:val="18"/>
                 <w:szCs w:val="18"/>
               </w:rPr>
-              <w:t>FR-NOT-03, FR-NOT-04, FR-EVT-04</w:t>
+              <w:t>FR-NOT-03</w:t>
             </w:r>
           </w:p>
         </w:tc>
@@ -23010,7 +24315,7 @@
                 <w:sz w:val="18"/>
                 <w:szCs w:val="18"/>
               </w:rPr>
-              <w:t>Real usage analytics, audit log</w:t>
+              <w:t>Schedule the retention purge; real database and storage health probes</w:t>
             </w:r>
           </w:p>
         </w:tc>
@@ -23036,7 +24341,7 @@
                 <w:sz w:val="18"/>
                 <w:szCs w:val="18"/>
               </w:rPr>
-              <w:t>FR-ADM-04, FR-ADM-05, FR-PUB-08</w:t>
+              <w:t>DR-05, FR-ADM-04</w:t>
             </w:r>
           </w:p>
         </w:tc>
@@ -23093,7 +24398,7 @@
                 <w:sz w:val="18"/>
                 <w:szCs w:val="18"/>
               </w:rPr>
-              <w:t>Ratings, booking, new services</w:t>
+              <w:t>Dedicated modules for further services</w:t>
             </w:r>
           </w:p>
         </w:tc>
@@ -23119,7 +24424,7 @@
                 <w:sz w:val="18"/>
                 <w:szCs w:val="18"/>
               </w:rPr>
-              <w:t>FR-SVC-07, FR-SVC-08, FR-SVC-09</w:t>
+              <w:t>FR-SVC-09</w:t>
             </w:r>
           </w:p>
         </w:tc>
@@ -23176,7 +24481,7 @@
                 <w:sz w:val="18"/>
                 <w:szCs w:val="18"/>
               </w:rPr>
-              <w:t>iOS build, accessibility audit, monitoring</w:t>
+              <w:t>iOS build, accessibility audit, uptime monitoring, tested restore</w:t>
             </w:r>
           </w:p>
         </w:tc>
@@ -23202,7 +24507,7 @@
                 <w:sz w:val="18"/>
                 <w:szCs w:val="18"/>
               </w:rPr>
-              <w:t>IR-UI-04, NFR-REL-01, NFR-REL-02</w:t>
+              <w:t>IR-UI-04, NFR-REL-01 to NFR-REL-03, NFR-REL-05</w:t>
             </w:r>
           </w:p>
         </w:tc>
@@ -24460,7 +25765,7 @@
         <w:sz w:val="17"/>
         <w:szCs w:val="17"/>
       </w:rPr>
-      <w:t>MySun SRS v1.0</w:t>
+      <w:t>MySun SRS v1.2</w:t>
     </w:r>
   </w:p>
 </w:hdr>

</xml_diff>